<commit_message>
comments on competition experiment procedure
</commit_message>
<xml_diff>
--- a/documents/resource ratio hypothesis/Draft Procedure v2_AM.docx
+++ b/documents/resource ratio hypothesis/Draft Procedure v2_AM.docx
@@ -49,23 +49,7 @@
             <w:sz w:val="24"/>
             <w:szCs w:val="24"/>
           </w:rPr>
-          <w:t>m</w:t>
-        </w:r>
-        <w:r>
-          <w:rPr>
-            <w:rFonts w:ascii="Times New Roman" w:eastAsia="Times New Roman" w:hAnsi="Times New Roman" w:cs="Times New Roman"/>
-            <w:sz w:val="24"/>
-            <w:szCs w:val="24"/>
-          </w:rPr>
-          <w:t>l</w:t>
-        </w:r>
-        <w:r>
-          <w:rPr>
-            <w:rFonts w:ascii="Times New Roman" w:eastAsia="Times New Roman" w:hAnsi="Times New Roman" w:cs="Times New Roman"/>
-            <w:sz w:val="24"/>
-            <w:szCs w:val="24"/>
-          </w:rPr>
-          <w:t xml:space="preserve"> </w:t>
+          <w:t xml:space="preserve">ml </w:t>
         </w:r>
       </w:ins>
       <w:r>
@@ -121,23 +105,7 @@
             <w:sz w:val="24"/>
             <w:szCs w:val="24"/>
           </w:rPr>
-          <w:t>m</w:t>
-        </w:r>
-        <w:r>
-          <w:rPr>
-            <w:rFonts w:ascii="Times New Roman" w:eastAsia="Times New Roman" w:hAnsi="Times New Roman" w:cs="Times New Roman"/>
-            <w:sz w:val="24"/>
-            <w:szCs w:val="24"/>
-          </w:rPr>
-          <w:t>l</w:t>
-        </w:r>
-        <w:r>
-          <w:rPr>
-            <w:rFonts w:ascii="Times New Roman" w:eastAsia="Times New Roman" w:hAnsi="Times New Roman" w:cs="Times New Roman"/>
-            <w:sz w:val="24"/>
-            <w:szCs w:val="24"/>
-          </w:rPr>
-          <w:t xml:space="preserve"> </w:t>
+          <w:t xml:space="preserve">ml </w:t>
         </w:r>
       </w:ins>
       <w:r>
@@ -175,23 +143,7 @@
             <w:sz w:val="24"/>
             <w:szCs w:val="24"/>
           </w:rPr>
-          <w:t>m</w:t>
-        </w:r>
-        <w:r>
-          <w:rPr>
-            <w:rFonts w:ascii="Times New Roman" w:eastAsia="Times New Roman" w:hAnsi="Times New Roman" w:cs="Times New Roman"/>
-            <w:sz w:val="24"/>
-            <w:szCs w:val="24"/>
-          </w:rPr>
-          <w:t>l</w:t>
-        </w:r>
-        <w:r>
-          <w:rPr>
-            <w:rFonts w:ascii="Times New Roman" w:eastAsia="Times New Roman" w:hAnsi="Times New Roman" w:cs="Times New Roman"/>
-            <w:sz w:val="24"/>
-            <w:szCs w:val="24"/>
-          </w:rPr>
-          <w:t xml:space="preserve"> </w:t>
+          <w:t xml:space="preserve">ml </w:t>
         </w:r>
       </w:ins>
       <w:r>
@@ -219,23 +171,7 @@
             <w:sz w:val="24"/>
             <w:szCs w:val="24"/>
           </w:rPr>
-          <w:t>medi</w:t>
-        </w:r>
-        <w:r>
-          <w:rPr>
-            <w:rFonts w:ascii="Times New Roman" w:eastAsia="Times New Roman" w:hAnsi="Times New Roman" w:cs="Times New Roman"/>
-            <w:sz w:val="24"/>
-            <w:szCs w:val="24"/>
-          </w:rPr>
-          <w:t>um</w:t>
-        </w:r>
-        <w:r>
-          <w:rPr>
-            <w:rFonts w:ascii="Times New Roman" w:eastAsia="Times New Roman" w:hAnsi="Times New Roman" w:cs="Times New Roman"/>
-            <w:sz w:val="24"/>
-            <w:szCs w:val="24"/>
-          </w:rPr>
-          <w:t xml:space="preserve"> </w:t>
+          <w:t xml:space="preserve">medium </w:t>
         </w:r>
       </w:ins>
       <w:r>
@@ -370,15 +306,34 @@
           <w:t xml:space="preserve">compound </w:t>
         </w:r>
       </w:ins>
-      <w:r>
-        <w:rPr>
-          <w:rFonts w:ascii="Times New Roman" w:eastAsia="Times New Roman" w:hAnsi="Times New Roman" w:cs="Times New Roman"/>
-          <w:sz w:val="24"/>
-          <w:szCs w:val="24"/>
-        </w:rPr>
-        <w:t xml:space="preserve">microscope to verify the absence of </w:t>
-      </w:r>
-      <w:ins w:id="22" w:author="Mendelson, Alex" w:date="2026-10-04T09:33:00Z" w16du:dateUtc="2026-10-04T16:33:00Z">
+      <w:commentRangeStart w:id="22"/>
+      <w:r>
+        <w:rPr>
+          <w:rFonts w:ascii="Times New Roman" w:eastAsia="Times New Roman" w:hAnsi="Times New Roman" w:cs="Times New Roman"/>
+          <w:sz w:val="24"/>
+          <w:szCs w:val="24"/>
+        </w:rPr>
+        <w:t xml:space="preserve">microscope </w:t>
+      </w:r>
+      <w:commentRangeEnd w:id="22"/>
+      <w:r>
+        <w:rPr>
+          <w:rStyle w:val="CommentReference"/>
+          <w:rFonts w:ascii="Times New Roman" w:eastAsia="Times New Roman" w:hAnsi="Times New Roman" w:cs="Times New Roman"/>
+          <w:sz w:val="24"/>
+          <w:szCs w:val="24"/>
+        </w:rPr>
+        <w:commentReference w:id="22"/>
+      </w:r>
+      <w:r>
+        <w:rPr>
+          <w:rFonts w:ascii="Times New Roman" w:eastAsia="Times New Roman" w:hAnsi="Times New Roman" w:cs="Times New Roman"/>
+          <w:sz w:val="24"/>
+          <w:szCs w:val="24"/>
+        </w:rPr>
+        <w:t xml:space="preserve">to verify the absence of </w:t>
+      </w:r>
+      <w:ins w:id="23" w:author="Mendelson, Alex" w:date="2026-10-04T09:33:00Z" w16du:dateUtc="2026-10-04T16:33:00Z">
         <w:r>
           <w:rPr>
             <w:rFonts w:ascii="Times New Roman" w:eastAsia="Times New Roman" w:hAnsi="Times New Roman" w:cs="Times New Roman"/>
@@ -425,7 +380,7 @@
         </w:rPr>
         <w:t>Label sixty 50</w:t>
       </w:r>
-      <w:ins w:id="23" w:author="Mendelson, Alex" w:date="2026-10-04T09:34:00Z" w16du:dateUtc="2026-10-04T16:34:00Z">
+      <w:ins w:id="24" w:author="Mendelson, Alex" w:date="2026-10-04T09:34:00Z" w16du:dateUtc="2026-10-04T16:34:00Z">
         <w:r>
           <w:rPr>
             <w:rFonts w:ascii="Times New Roman" w:eastAsia="Times New Roman" w:hAnsi="Times New Roman" w:cs="Times New Roman"/>
@@ -435,7 +390,7 @@
           <w:t>-</w:t>
         </w:r>
       </w:ins>
-      <w:del w:id="24" w:author="Mendelson, Alex" w:date="2026-10-04T09:34:00Z" w16du:dateUtc="2026-10-04T16:34:00Z">
+      <w:del w:id="25" w:author="Mendelson, Alex" w:date="2026-10-04T09:34:00Z" w16du:dateUtc="2026-10-04T16:34:00Z">
         <w:r>
           <w:rPr>
             <w:rFonts w:ascii="Times New Roman" w:eastAsia="Times New Roman" w:hAnsi="Times New Roman" w:cs="Times New Roman"/>
@@ -445,23 +400,45 @@
           <w:delText xml:space="preserve">mL </w:delText>
         </w:r>
       </w:del>
-      <w:ins w:id="25" w:author="Mendelson, Alex" w:date="2026-10-04T09:34:00Z" w16du:dateUtc="2026-10-04T16:34:00Z">
-        <w:r>
-          <w:rPr>
-            <w:rFonts w:ascii="Times New Roman" w:eastAsia="Times New Roman" w:hAnsi="Times New Roman" w:cs="Times New Roman"/>
-            <w:sz w:val="24"/>
-            <w:szCs w:val="24"/>
-          </w:rPr>
-          <w:t>m</w:t>
-        </w:r>
-        <w:r>
-          <w:rPr>
-            <w:rFonts w:ascii="Times New Roman" w:eastAsia="Times New Roman" w:hAnsi="Times New Roman" w:cs="Times New Roman"/>
-            <w:sz w:val="24"/>
-            <w:szCs w:val="24"/>
-          </w:rPr>
-          <w:t>l</w:t>
-        </w:r>
+      <w:ins w:id="26" w:author="Mendelson, Alex" w:date="2026-10-04T09:34:00Z" w16du:dateUtc="2026-10-04T16:34:00Z">
+        <w:r>
+          <w:rPr>
+            <w:rFonts w:ascii="Times New Roman" w:eastAsia="Times New Roman" w:hAnsi="Times New Roman" w:cs="Times New Roman"/>
+            <w:sz w:val="24"/>
+            <w:szCs w:val="24"/>
+          </w:rPr>
+          <w:t xml:space="preserve">ml </w:t>
+        </w:r>
+      </w:ins>
+      <w:del w:id="27" w:author="Mendelson, Alex" w:date="2026-10-04T09:34:00Z" w16du:dateUtc="2026-10-04T16:34:00Z">
+        <w:r>
+          <w:rPr>
+            <w:rFonts w:ascii="Times New Roman" w:eastAsia="Times New Roman" w:hAnsi="Times New Roman" w:cs="Times New Roman"/>
+            <w:sz w:val="24"/>
+            <w:szCs w:val="24"/>
+          </w:rPr>
+          <w:delText xml:space="preserve">falcon </w:delText>
+        </w:r>
+      </w:del>
+      <w:ins w:id="28" w:author="Mendelson, Alex" w:date="2026-10-04T09:34:00Z" w16du:dateUtc="2026-10-04T16:34:00Z">
+        <w:r>
+          <w:rPr>
+            <w:rFonts w:ascii="Times New Roman" w:eastAsia="Times New Roman" w:hAnsi="Times New Roman" w:cs="Times New Roman"/>
+            <w:sz w:val="24"/>
+            <w:szCs w:val="24"/>
+          </w:rPr>
+          <w:t xml:space="preserve">conical </w:t>
+        </w:r>
+      </w:ins>
+      <w:r>
+        <w:rPr>
+          <w:rFonts w:ascii="Times New Roman" w:eastAsia="Times New Roman" w:hAnsi="Times New Roman" w:cs="Times New Roman"/>
+          <w:sz w:val="24"/>
+          <w:szCs w:val="24"/>
+        </w:rPr>
+        <w:t>tubes with temperature history (25</w:t>
+      </w:r>
+      <w:ins w:id="29" w:author="Mendelson, Alex" w:date="2026-10-04T09:34:00Z" w16du:dateUtc="2026-10-04T16:34:00Z">
         <w:r>
           <w:rPr>
             <w:rFonts w:ascii="Times New Roman" w:eastAsia="Times New Roman" w:hAnsi="Times New Roman" w:cs="Times New Roman"/>
@@ -471,52 +448,6 @@
           <w:t xml:space="preserve"> </w:t>
         </w:r>
       </w:ins>
-      <w:del w:id="26" w:author="Mendelson, Alex" w:date="2026-10-04T09:34:00Z" w16du:dateUtc="2026-10-04T16:34:00Z">
-        <w:r>
-          <w:rPr>
-            <w:rFonts w:ascii="Times New Roman" w:eastAsia="Times New Roman" w:hAnsi="Times New Roman" w:cs="Times New Roman"/>
-            <w:sz w:val="24"/>
-            <w:szCs w:val="24"/>
-          </w:rPr>
-          <w:delText xml:space="preserve">falcon </w:delText>
-        </w:r>
-      </w:del>
-      <w:ins w:id="27" w:author="Mendelson, Alex" w:date="2026-10-04T09:34:00Z" w16du:dateUtc="2026-10-04T16:34:00Z">
-        <w:r>
-          <w:rPr>
-            <w:rFonts w:ascii="Times New Roman" w:eastAsia="Times New Roman" w:hAnsi="Times New Roman" w:cs="Times New Roman"/>
-            <w:sz w:val="24"/>
-            <w:szCs w:val="24"/>
-          </w:rPr>
-          <w:t>conical</w:t>
-        </w:r>
-        <w:r>
-          <w:rPr>
-            <w:rFonts w:ascii="Times New Roman" w:eastAsia="Times New Roman" w:hAnsi="Times New Roman" w:cs="Times New Roman"/>
-            <w:sz w:val="24"/>
-            <w:szCs w:val="24"/>
-          </w:rPr>
-          <w:t xml:space="preserve"> </w:t>
-        </w:r>
-      </w:ins>
-      <w:r>
-        <w:rPr>
-          <w:rFonts w:ascii="Times New Roman" w:eastAsia="Times New Roman" w:hAnsi="Times New Roman" w:cs="Times New Roman"/>
-          <w:sz w:val="24"/>
-          <w:szCs w:val="24"/>
-        </w:rPr>
-        <w:t>tubes with temperature history (25</w:t>
-      </w:r>
-      <w:ins w:id="28" w:author="Mendelson, Alex" w:date="2026-10-04T09:34:00Z" w16du:dateUtc="2026-10-04T16:34:00Z">
-        <w:r>
-          <w:rPr>
-            <w:rFonts w:ascii="Times New Roman" w:eastAsia="Times New Roman" w:hAnsi="Times New Roman" w:cs="Times New Roman"/>
-            <w:sz w:val="24"/>
-            <w:szCs w:val="24"/>
-          </w:rPr>
-          <w:t xml:space="preserve"> </w:t>
-        </w:r>
-      </w:ins>
       <w:r>
         <w:rPr>
           <w:rFonts w:ascii="Times New Roman" w:eastAsia="Times New Roman" w:hAnsi="Times New Roman" w:cs="Times New Roman"/>
@@ -525,7 +456,7 @@
         </w:rPr>
         <w:t>℃ or 30</w:t>
       </w:r>
-      <w:ins w:id="29" w:author="Mendelson, Alex" w:date="2026-10-04T09:34:00Z" w16du:dateUtc="2026-10-04T16:34:00Z">
+      <w:ins w:id="30" w:author="Mendelson, Alex" w:date="2026-10-04T09:34:00Z" w16du:dateUtc="2026-10-04T16:34:00Z">
         <w:r>
           <w:rPr>
             <w:rFonts w:ascii="Times New Roman" w:eastAsia="Times New Roman" w:hAnsi="Times New Roman" w:cs="Times New Roman"/>
@@ -690,7 +621,7 @@
         </w:rPr>
         <w:t xml:space="preserve">Fill tubes with 20 </w:t>
       </w:r>
-      <w:del w:id="30" w:author="Mendelson, Alex" w:date="2026-10-04T09:35:00Z" w16du:dateUtc="2026-10-04T16:35:00Z">
+      <w:del w:id="31" w:author="Mendelson, Alex" w:date="2026-10-04T09:35:00Z" w16du:dateUtc="2026-10-04T16:35:00Z">
         <w:r>
           <w:rPr>
             <w:rFonts w:ascii="Times New Roman" w:eastAsia="Times New Roman" w:hAnsi="Times New Roman" w:cs="Times New Roman"/>
@@ -700,30 +631,14 @@
           <w:delText xml:space="preserve">mL </w:delText>
         </w:r>
       </w:del>
-      <w:ins w:id="31" w:author="Mendelson, Alex" w:date="2026-10-04T09:35:00Z" w16du:dateUtc="2026-10-04T16:35:00Z">
-        <w:r>
-          <w:rPr>
-            <w:rFonts w:ascii="Times New Roman" w:eastAsia="Times New Roman" w:hAnsi="Times New Roman" w:cs="Times New Roman"/>
-            <w:sz w:val="24"/>
-            <w:szCs w:val="24"/>
-          </w:rPr>
-          <w:t>m</w:t>
-        </w:r>
-        <w:r>
-          <w:rPr>
-            <w:rFonts w:ascii="Times New Roman" w:eastAsia="Times New Roman" w:hAnsi="Times New Roman" w:cs="Times New Roman"/>
-            <w:sz w:val="24"/>
-            <w:szCs w:val="24"/>
-          </w:rPr>
-          <w:t>l</w:t>
-        </w:r>
-        <w:r>
-          <w:rPr>
-            <w:rFonts w:ascii="Times New Roman" w:eastAsia="Times New Roman" w:hAnsi="Times New Roman" w:cs="Times New Roman"/>
-            <w:sz w:val="24"/>
-            <w:szCs w:val="24"/>
-          </w:rPr>
-          <w:t xml:space="preserve"> </w:t>
+      <w:ins w:id="32" w:author="Mendelson, Alex" w:date="2026-10-04T09:35:00Z" w16du:dateUtc="2026-10-04T16:35:00Z">
+        <w:r>
+          <w:rPr>
+            <w:rFonts w:ascii="Times New Roman" w:eastAsia="Times New Roman" w:hAnsi="Times New Roman" w:cs="Times New Roman"/>
+            <w:sz w:val="24"/>
+            <w:szCs w:val="24"/>
+          </w:rPr>
+          <w:t xml:space="preserve">ml </w:t>
         </w:r>
       </w:ins>
       <w:r>
@@ -734,7 +649,7 @@
         </w:rPr>
         <w:t xml:space="preserve">of rotifer </w:t>
       </w:r>
-      <w:del w:id="32" w:author="Mendelson, Alex" w:date="2026-10-04T09:35:00Z" w16du:dateUtc="2026-10-04T16:35:00Z">
+      <w:del w:id="33" w:author="Mendelson, Alex" w:date="2026-10-04T09:35:00Z" w16du:dateUtc="2026-10-04T16:35:00Z">
         <w:r>
           <w:rPr>
             <w:rFonts w:ascii="Times New Roman" w:eastAsia="Times New Roman" w:hAnsi="Times New Roman" w:cs="Times New Roman"/>
@@ -744,15 +659,70 @@
           <w:delText>media</w:delText>
         </w:r>
       </w:del>
-      <w:ins w:id="33" w:author="Mendelson, Alex" w:date="2026-10-04T09:35:00Z" w16du:dateUtc="2026-10-04T16:35:00Z">
-        <w:r>
-          <w:rPr>
-            <w:rFonts w:ascii="Times New Roman" w:eastAsia="Times New Roman" w:hAnsi="Times New Roman" w:cs="Times New Roman"/>
-            <w:sz w:val="24"/>
-            <w:szCs w:val="24"/>
-          </w:rPr>
-          <w:t>medi</w:t>
-        </w:r>
+      <w:ins w:id="34" w:author="Mendelson, Alex" w:date="2026-10-04T09:35:00Z" w16du:dateUtc="2026-10-04T16:35:00Z">
+        <w:r>
+          <w:rPr>
+            <w:rFonts w:ascii="Times New Roman" w:eastAsia="Times New Roman" w:hAnsi="Times New Roman" w:cs="Times New Roman"/>
+            <w:sz w:val="24"/>
+            <w:szCs w:val="24"/>
+          </w:rPr>
+          <w:t>medium</w:t>
+        </w:r>
+      </w:ins>
+      <w:r>
+        <w:rPr>
+          <w:rFonts w:ascii="Times New Roman" w:eastAsia="Times New Roman" w:hAnsi="Times New Roman" w:cs="Times New Roman"/>
+          <w:sz w:val="24"/>
+          <w:szCs w:val="24"/>
+        </w:rPr>
+        <w:t xml:space="preserve">. </w:t>
+      </w:r>
+      <w:commentRangeStart w:id="35"/>
+      <w:r>
+        <w:rPr>
+          <w:rFonts w:ascii="Times New Roman" w:eastAsia="Times New Roman" w:hAnsi="Times New Roman" w:cs="Times New Roman"/>
+          <w:sz w:val="24"/>
+          <w:szCs w:val="24"/>
+        </w:rPr>
+        <w:t>Record the pH and DO</w:t>
+      </w:r>
+      <w:commentRangeEnd w:id="35"/>
+      <w:r>
+        <w:rPr>
+          <w:rStyle w:val="CommentReference"/>
+          <w:rFonts w:ascii="Times New Roman" w:eastAsia="Times New Roman" w:hAnsi="Times New Roman" w:cs="Times New Roman"/>
+          <w:sz w:val="24"/>
+          <w:szCs w:val="24"/>
+        </w:rPr>
+        <w:commentReference w:id="35"/>
+      </w:r>
+      <w:r>
+        <w:rPr>
+          <w:rFonts w:ascii="Times New Roman" w:eastAsia="Times New Roman" w:hAnsi="Times New Roman" w:cs="Times New Roman"/>
+          <w:sz w:val="24"/>
+          <w:szCs w:val="24"/>
+        </w:rPr>
+        <w:t xml:space="preserve"> of </w:t>
+      </w:r>
+      <w:del w:id="36" w:author="Mendelson, Alex" w:date="2026-10-04T09:35:00Z" w16du:dateUtc="2026-10-04T16:35:00Z">
+        <w:r>
+          <w:rPr>
+            <w:rFonts w:ascii="Times New Roman" w:eastAsia="Times New Roman" w:hAnsi="Times New Roman" w:cs="Times New Roman"/>
+            <w:sz w:val="24"/>
+            <w:szCs w:val="24"/>
+          </w:rPr>
+          <w:delText xml:space="preserve">rotifer </w:delText>
+        </w:r>
+      </w:del>
+      <w:r>
+        <w:rPr>
+          <w:rFonts w:ascii="Times New Roman" w:eastAsia="Times New Roman" w:hAnsi="Times New Roman" w:cs="Times New Roman"/>
+          <w:sz w:val="24"/>
+          <w:szCs w:val="24"/>
+        </w:rPr>
+        <w:t>medi</w:t>
+      </w:r>
+      <w:ins w:id="37" w:author="Mendelson, Alex" w:date="2026-10-04T09:35:00Z" w16du:dateUtc="2026-10-04T16:35:00Z">
         <w:r>
           <w:rPr>
             <w:rFonts w:ascii="Times New Roman" w:eastAsia="Times New Roman" w:hAnsi="Times New Roman" w:cs="Times New Roman"/>
@@ -762,53 +732,17 @@
           <w:t>um</w:t>
         </w:r>
       </w:ins>
-      <w:r>
-        <w:rPr>
-          <w:rFonts w:ascii="Times New Roman" w:eastAsia="Times New Roman" w:hAnsi="Times New Roman" w:cs="Times New Roman"/>
-          <w:sz w:val="24"/>
-          <w:szCs w:val="24"/>
-        </w:rPr>
-        <w:t xml:space="preserve">. Record the pH and DO of </w:t>
-      </w:r>
-      <w:del w:id="34" w:author="Mendelson, Alex" w:date="2026-10-04T09:35:00Z" w16du:dateUtc="2026-10-04T16:35:00Z">
-        <w:r>
-          <w:rPr>
-            <w:rFonts w:ascii="Times New Roman" w:eastAsia="Times New Roman" w:hAnsi="Times New Roman" w:cs="Times New Roman"/>
-            <w:sz w:val="24"/>
-            <w:szCs w:val="24"/>
-          </w:rPr>
-          <w:delText xml:space="preserve">rotifer </w:delText>
+      <w:del w:id="38" w:author="Mendelson, Alex" w:date="2026-10-04T09:35:00Z" w16du:dateUtc="2026-10-04T16:35:00Z">
+        <w:r>
+          <w:rPr>
+            <w:rFonts w:ascii="Times New Roman" w:eastAsia="Times New Roman" w:hAnsi="Times New Roman" w:cs="Times New Roman"/>
+            <w:sz w:val="24"/>
+            <w:szCs w:val="24"/>
+          </w:rPr>
+          <w:delText>a</w:delText>
         </w:r>
       </w:del>
-      <w:r>
-        <w:rPr>
-          <w:rFonts w:ascii="Times New Roman" w:eastAsia="Times New Roman" w:hAnsi="Times New Roman" w:cs="Times New Roman"/>
-          <w:sz w:val="24"/>
-          <w:szCs w:val="24"/>
-        </w:rPr>
-        <w:t>medi</w:t>
-      </w:r>
-      <w:ins w:id="35" w:author="Mendelson, Alex" w:date="2026-10-04T09:35:00Z" w16du:dateUtc="2026-10-04T16:35:00Z">
-        <w:r>
-          <w:rPr>
-            <w:rFonts w:ascii="Times New Roman" w:eastAsia="Times New Roman" w:hAnsi="Times New Roman" w:cs="Times New Roman"/>
-            <w:sz w:val="24"/>
-            <w:szCs w:val="24"/>
-          </w:rPr>
-          <w:t>um</w:t>
-        </w:r>
-      </w:ins>
-      <w:del w:id="36" w:author="Mendelson, Alex" w:date="2026-10-04T09:35:00Z" w16du:dateUtc="2026-10-04T16:35:00Z">
-        <w:r>
-          <w:rPr>
-            <w:rFonts w:ascii="Times New Roman" w:eastAsia="Times New Roman" w:hAnsi="Times New Roman" w:cs="Times New Roman"/>
-            <w:sz w:val="24"/>
-            <w:szCs w:val="24"/>
-          </w:rPr>
-          <w:delText>a</w:delText>
-        </w:r>
-      </w:del>
-      <w:del w:id="37" w:author="Mendelson, Alex" w:date="2026-10-04T09:36:00Z" w16du:dateUtc="2026-10-04T16:36:00Z">
+      <w:del w:id="39" w:author="Mendelson, Alex" w:date="2026-10-04T09:36:00Z" w16du:dateUtc="2026-10-04T16:36:00Z">
         <w:r>
           <w:rPr>
             <w:rFonts w:ascii="Times New Roman" w:eastAsia="Times New Roman" w:hAnsi="Times New Roman" w:cs="Times New Roman"/>
@@ -847,7 +781,7 @@
         </w:rPr>
         <w:t>Grab a pair of tubes with a high concentration of rotifers from their respective growth chambers. Vortex mix both tubes and immediately pipette 100</w:t>
       </w:r>
-      <w:ins w:id="38" w:author="Mendelson, Alex" w:date="2026-10-04T09:36:00Z" w16du:dateUtc="2026-10-04T16:36:00Z">
+      <w:ins w:id="40" w:author="Mendelson, Alex" w:date="2026-10-04T09:36:00Z" w16du:dateUtc="2026-10-04T16:36:00Z">
         <w:r>
           <w:rPr>
             <w:rFonts w:ascii="Times New Roman" w:eastAsia="Times New Roman" w:hAnsi="Times New Roman" w:cs="Times New Roman"/>
@@ -865,7 +799,7 @@
         </w:rPr>
         <w:t>μ</w:t>
       </w:r>
-      <w:ins w:id="39" w:author="Mendelson, Alex" w:date="2026-10-04T09:36:00Z" w16du:dateUtc="2026-10-04T16:36:00Z">
+      <w:ins w:id="41" w:author="Mendelson, Alex" w:date="2026-10-04T09:36:00Z" w16du:dateUtc="2026-10-04T16:36:00Z">
         <w:r>
           <w:rPr>
             <w:rFonts w:ascii="Times New Roman" w:eastAsia="Times New Roman" w:hAnsi="Times New Roman" w:cs="Times New Roman"/>
@@ -875,7 +809,7 @@
           <w:t>l</w:t>
         </w:r>
       </w:ins>
-      <w:del w:id="40" w:author="Mendelson, Alex" w:date="2026-10-04T09:36:00Z" w16du:dateUtc="2026-10-04T16:36:00Z">
+      <w:del w:id="42" w:author="Mendelson, Alex" w:date="2026-10-04T09:36:00Z" w16du:dateUtc="2026-10-04T16:36:00Z">
         <w:r>
           <w:rPr>
             <w:rFonts w:ascii="Times New Roman" w:eastAsia="Times New Roman" w:hAnsi="Times New Roman" w:cs="Times New Roman"/>
@@ -893,7 +827,7 @@
         </w:rPr>
         <w:t xml:space="preserve"> of each onto separate Palmer cells. Then, count and record the number of rotifers present on the slides. Repeat three times and average the counts for each tube. Estimate the total concentration of rotifers in each tube and determine </w:t>
       </w:r>
-      <w:del w:id="41" w:author="Mendelson, Alex" w:date="2026-10-04T09:37:00Z" w16du:dateUtc="2026-10-04T16:37:00Z">
+      <w:del w:id="43" w:author="Mendelson, Alex" w:date="2026-10-04T09:37:00Z" w16du:dateUtc="2026-10-04T16:37:00Z">
         <w:r>
           <w:rPr>
             <w:rFonts w:ascii="Times New Roman" w:eastAsia="Times New Roman" w:hAnsi="Times New Roman" w:cs="Times New Roman"/>
@@ -903,7 +837,7 @@
           <w:delText>how many microliters are necessary to pull out</w:delText>
         </w:r>
       </w:del>
-      <w:ins w:id="42" w:author="Mendelson, Alex" w:date="2026-10-04T09:37:00Z" w16du:dateUtc="2026-10-04T16:37:00Z">
+      <w:ins w:id="44" w:author="Mendelson, Alex" w:date="2026-10-04T09:37:00Z" w16du:dateUtc="2026-10-04T16:37:00Z">
         <w:r>
           <w:rPr>
             <w:rFonts w:ascii="Times New Roman" w:eastAsia="Times New Roman" w:hAnsi="Times New Roman" w:cs="Times New Roman"/>
@@ -913,7 +847,7 @@
           <w:t>what volume is necess</w:t>
         </w:r>
       </w:ins>
-      <w:ins w:id="43" w:author="Mendelson, Alex" w:date="2026-10-04T09:38:00Z" w16du:dateUtc="2026-10-04T16:38:00Z">
+      <w:ins w:id="45" w:author="Mendelson, Alex" w:date="2026-10-04T09:38:00Z" w16du:dateUtc="2026-10-04T16:38:00Z">
         <w:r>
           <w:rPr>
             <w:rFonts w:ascii="Times New Roman" w:eastAsia="Times New Roman" w:hAnsi="Times New Roman" w:cs="Times New Roman"/>
@@ -931,7 +865,7 @@
         </w:rPr>
         <w:t xml:space="preserve"> ~x (number of rotifers) </w:t>
       </w:r>
-      <w:ins w:id="44" w:author="Mendelson, Alex" w:date="2026-10-04T09:38:00Z" w16du:dateUtc="2026-10-04T16:38:00Z">
+      <w:ins w:id="46" w:author="Mendelson, Alex" w:date="2026-10-04T09:38:00Z" w16du:dateUtc="2026-10-04T16:38:00Z">
         <w:r>
           <w:rPr>
             <w:rFonts w:ascii="Times New Roman" w:eastAsia="Times New Roman" w:hAnsi="Times New Roman" w:cs="Times New Roman"/>
@@ -949,7 +883,7 @@
         </w:rPr>
         <w:t>in</w:t>
       </w:r>
-      <w:del w:id="45" w:author="Mendelson, Alex" w:date="2026-10-04T09:38:00Z" w16du:dateUtc="2026-10-04T16:38:00Z">
+      <w:del w:id="47" w:author="Mendelson, Alex" w:date="2026-10-04T09:38:00Z" w16du:dateUtc="2026-10-04T16:38:00Z">
         <w:r>
           <w:rPr>
             <w:rFonts w:ascii="Times New Roman" w:eastAsia="Times New Roman" w:hAnsi="Times New Roman" w:cs="Times New Roman"/>
@@ -1030,7 +964,7 @@
         </w:rPr>
         <w:t xml:space="preserve"> L-tubes receive 2</w:t>
       </w:r>
-      <w:ins w:id="46" w:author="Mendelson, Alex" w:date="2026-10-04T09:38:00Z" w16du:dateUtc="2026-10-04T16:38:00Z">
+      <w:ins w:id="48" w:author="Mendelson, Alex" w:date="2026-10-04T09:38:00Z" w16du:dateUtc="2026-10-04T16:38:00Z">
         <w:r>
           <w:rPr>
             <w:rFonts w:ascii="Times New Roman" w:eastAsia="Times New Roman" w:hAnsi="Times New Roman" w:cs="Times New Roman"/>
@@ -1048,7 +982,7 @@
         </w:rPr>
         <w:t>μ</w:t>
       </w:r>
-      <w:ins w:id="47" w:author="Mendelson, Alex" w:date="2026-10-04T09:38:00Z" w16du:dateUtc="2026-10-04T16:38:00Z">
+      <w:ins w:id="49" w:author="Mendelson, Alex" w:date="2026-10-04T09:38:00Z" w16du:dateUtc="2026-10-04T16:38:00Z">
         <w:r>
           <w:rPr>
             <w:rFonts w:ascii="Times New Roman" w:eastAsia="Times New Roman" w:hAnsi="Times New Roman" w:cs="Times New Roman"/>
@@ -1058,7 +992,7 @@
           <w:t>l</w:t>
         </w:r>
       </w:ins>
-      <w:del w:id="48" w:author="Mendelson, Alex" w:date="2026-10-04T09:38:00Z" w16du:dateUtc="2026-10-04T16:38:00Z">
+      <w:del w:id="50" w:author="Mendelson, Alex" w:date="2026-10-04T09:38:00Z" w16du:dateUtc="2026-10-04T16:38:00Z">
         <w:r>
           <w:rPr>
             <w:rFonts w:ascii="Times New Roman" w:eastAsia="Times New Roman" w:hAnsi="Times New Roman" w:cs="Times New Roman"/>
@@ -1089,7 +1023,7 @@
         </w:rPr>
         <w:t>M-tubes receive 20</w:t>
       </w:r>
-      <w:ins w:id="49" w:author="Mendelson, Alex" w:date="2026-10-04T09:39:00Z" w16du:dateUtc="2026-10-04T16:39:00Z">
+      <w:ins w:id="51" w:author="Mendelson, Alex" w:date="2026-10-04T09:39:00Z" w16du:dateUtc="2026-10-04T16:39:00Z">
         <w:r>
           <w:rPr>
             <w:rFonts w:ascii="Times New Roman" w:eastAsia="Times New Roman" w:hAnsi="Times New Roman" w:cs="Times New Roman"/>
@@ -1107,7 +1041,7 @@
         </w:rPr>
         <w:t>μ</w:t>
       </w:r>
-      <w:ins w:id="50" w:author="Mendelson, Alex" w:date="2026-10-04T09:39:00Z" w16du:dateUtc="2026-10-04T16:39:00Z">
+      <w:ins w:id="52" w:author="Mendelson, Alex" w:date="2026-10-04T09:39:00Z" w16du:dateUtc="2026-10-04T16:39:00Z">
         <w:r>
           <w:rPr>
             <w:rFonts w:ascii="Times New Roman" w:eastAsia="Times New Roman" w:hAnsi="Times New Roman" w:cs="Times New Roman"/>
@@ -1117,7 +1051,7 @@
           <w:t>l</w:t>
         </w:r>
       </w:ins>
-      <w:del w:id="51" w:author="Mendelson, Alex" w:date="2026-10-04T09:39:00Z" w16du:dateUtc="2026-10-04T16:39:00Z">
+      <w:del w:id="53" w:author="Mendelson, Alex" w:date="2026-10-04T09:39:00Z" w16du:dateUtc="2026-10-04T16:39:00Z">
         <w:r>
           <w:rPr>
             <w:rFonts w:ascii="Times New Roman" w:eastAsia="Times New Roman" w:hAnsi="Times New Roman" w:cs="Times New Roman"/>
@@ -1148,7 +1082,7 @@
         </w:rPr>
         <w:t>MH-tubes receive 200</w:t>
       </w:r>
-      <w:ins w:id="52" w:author="Mendelson, Alex" w:date="2026-10-04T09:39:00Z" w16du:dateUtc="2026-10-04T16:39:00Z">
+      <w:ins w:id="54" w:author="Mendelson, Alex" w:date="2026-10-04T09:39:00Z" w16du:dateUtc="2026-10-04T16:39:00Z">
         <w:r>
           <w:rPr>
             <w:rFonts w:ascii="Times New Roman" w:eastAsia="Times New Roman" w:hAnsi="Times New Roman" w:cs="Times New Roman"/>
@@ -1166,7 +1100,7 @@
         </w:rPr>
         <w:t>μ</w:t>
       </w:r>
-      <w:ins w:id="53" w:author="Mendelson, Alex" w:date="2026-10-04T09:39:00Z" w16du:dateUtc="2026-10-04T16:39:00Z">
+      <w:ins w:id="55" w:author="Mendelson, Alex" w:date="2026-10-04T09:39:00Z" w16du:dateUtc="2026-10-04T16:39:00Z">
         <w:r>
           <w:rPr>
             <w:rFonts w:ascii="Times New Roman" w:eastAsia="Times New Roman" w:hAnsi="Times New Roman" w:cs="Times New Roman"/>
@@ -1176,7 +1110,7 @@
           <w:t>l</w:t>
         </w:r>
       </w:ins>
-      <w:del w:id="54" w:author="Mendelson, Alex" w:date="2026-10-04T09:39:00Z" w16du:dateUtc="2026-10-04T16:39:00Z">
+      <w:del w:id="56" w:author="Mendelson, Alex" w:date="2026-10-04T09:39:00Z" w16du:dateUtc="2026-10-04T16:39:00Z">
         <w:r>
           <w:rPr>
             <w:rFonts w:ascii="Times New Roman" w:eastAsia="Times New Roman" w:hAnsi="Times New Roman" w:cs="Times New Roman"/>
@@ -1207,7 +1141,7 @@
         </w:rPr>
         <w:t>H-tubes receive 2</w:t>
       </w:r>
-      <w:ins w:id="55" w:author="Mendelson, Alex" w:date="2026-10-04T09:39:00Z" w16du:dateUtc="2026-10-04T16:39:00Z">
+      <w:ins w:id="57" w:author="Mendelson, Alex" w:date="2026-10-04T09:39:00Z" w16du:dateUtc="2026-10-04T16:39:00Z">
         <w:r>
           <w:rPr>
             <w:rFonts w:ascii="Times New Roman" w:eastAsia="Times New Roman" w:hAnsi="Times New Roman" w:cs="Times New Roman"/>
@@ -1225,7 +1159,7 @@
         </w:rPr>
         <w:t>m</w:t>
       </w:r>
-      <w:ins w:id="56" w:author="Mendelson, Alex" w:date="2026-10-04T09:39:00Z" w16du:dateUtc="2026-10-04T16:39:00Z">
+      <w:ins w:id="58" w:author="Mendelson, Alex" w:date="2026-10-04T09:39:00Z" w16du:dateUtc="2026-10-04T16:39:00Z">
         <w:r>
           <w:rPr>
             <w:rFonts w:ascii="Times New Roman" w:eastAsia="Times New Roman" w:hAnsi="Times New Roman" w:cs="Times New Roman"/>
@@ -1235,7 +1169,7 @@
           <w:t>l</w:t>
         </w:r>
       </w:ins>
-      <w:del w:id="57" w:author="Mendelson, Alex" w:date="2026-10-04T09:39:00Z" w16du:dateUtc="2026-10-04T16:39:00Z">
+      <w:del w:id="59" w:author="Mendelson, Alex" w:date="2026-10-04T09:39:00Z" w16du:dateUtc="2026-10-04T16:39:00Z">
         <w:r>
           <w:rPr>
             <w:rFonts w:ascii="Times New Roman" w:eastAsia="Times New Roman" w:hAnsi="Times New Roman" w:cs="Times New Roman"/>
@@ -1287,7 +1221,7 @@
         </w:rPr>
         <w:t xml:space="preserve">Vortex mix tube and immediately pipette 100μL onto a Palmer cell slide. </w:t>
       </w:r>
-      <w:del w:id="58" w:author="Mendelson, Alex" w:date="2026-10-04T09:39:00Z" w16du:dateUtc="2026-10-04T16:39:00Z">
+      <w:del w:id="60" w:author="Mendelson, Alex" w:date="2026-10-04T09:39:00Z" w16du:dateUtc="2026-10-04T16:39:00Z">
         <w:r>
           <w:rPr>
             <w:rFonts w:ascii="Times New Roman" w:eastAsia="Times New Roman" w:hAnsi="Times New Roman" w:cs="Times New Roman"/>
@@ -1297,7 +1231,7 @@
           <w:delText>Under a</w:delText>
         </w:r>
       </w:del>
-      <w:ins w:id="59" w:author="Mendelson, Alex" w:date="2026-10-04T09:39:00Z" w16du:dateUtc="2026-10-04T16:39:00Z">
+      <w:ins w:id="61" w:author="Mendelson, Alex" w:date="2026-10-04T09:39:00Z" w16du:dateUtc="2026-10-04T16:39:00Z">
         <w:r>
           <w:rPr>
             <w:rFonts w:ascii="Times New Roman" w:eastAsia="Times New Roman" w:hAnsi="Times New Roman" w:cs="Times New Roman"/>
@@ -1313,7 +1247,34 @@
           <w:sz w:val="24"/>
           <w:szCs w:val="24"/>
         </w:rPr>
-        <w:t xml:space="preserve"> microscope, count the total number of rotifers using a click counter. Repeat for all tubes, recording counts on an Excel spreadsheet. Thoroughly wash and dry slides and cover slips afterwards.</w:t>
+        <w:t xml:space="preserve"> </w:t>
+      </w:r>
+      <w:commentRangeStart w:id="62"/>
+      <w:r>
+        <w:rPr>
+          <w:rFonts w:ascii="Times New Roman" w:eastAsia="Times New Roman" w:hAnsi="Times New Roman" w:cs="Times New Roman"/>
+          <w:sz w:val="24"/>
+          <w:szCs w:val="24"/>
+        </w:rPr>
+        <w:t>microscope</w:t>
+      </w:r>
+      <w:commentRangeEnd w:id="62"/>
+      <w:r>
+        <w:rPr>
+          <w:rStyle w:val="CommentReference"/>
+          <w:rFonts w:ascii="Times New Roman" w:eastAsia="Times New Roman" w:hAnsi="Times New Roman" w:cs="Times New Roman"/>
+          <w:sz w:val="24"/>
+          <w:szCs w:val="24"/>
+        </w:rPr>
+        <w:commentReference w:id="62"/>
+      </w:r>
+      <w:r>
+        <w:rPr>
+          <w:rFonts w:ascii="Times New Roman" w:eastAsia="Times New Roman" w:hAnsi="Times New Roman" w:cs="Times New Roman"/>
+          <w:sz w:val="24"/>
+          <w:szCs w:val="24"/>
+        </w:rPr>
+        <w:t>, count the total number of rotifers using a click counter. Repeat for all tubes, recording counts on an Excel spreadsheet. Thoroughly wash and dry slides and cover slips afterwards.</w:t>
       </w:r>
     </w:p>
     <w:p>
@@ -1334,9 +1295,36 @@
           <w:sz w:val="24"/>
           <w:szCs w:val="24"/>
         </w:rPr>
-        <w:t>Lay out a standard 96-well plate and cover it with a piece of mesh to filter out rotifers and allow bacteria to pass through. Pipette x</w:t>
-      </w:r>
-      <w:ins w:id="60" w:author="Mendelson, Alex" w:date="2026-10-04T09:40:00Z" w16du:dateUtc="2026-10-04T16:40:00Z">
+        <w:t xml:space="preserve">Lay out a </w:t>
+      </w:r>
+      <w:commentRangeStart w:id="63"/>
+      <w:r>
+        <w:rPr>
+          <w:rFonts w:ascii="Times New Roman" w:eastAsia="Times New Roman" w:hAnsi="Times New Roman" w:cs="Times New Roman"/>
+          <w:sz w:val="24"/>
+          <w:szCs w:val="24"/>
+        </w:rPr>
+        <w:t xml:space="preserve">standard 96-well plate </w:t>
+      </w:r>
+      <w:commentRangeEnd w:id="63"/>
+      <w:r>
+        <w:rPr>
+          <w:rStyle w:val="CommentReference"/>
+          <w:rFonts w:ascii="Times New Roman" w:eastAsia="Times New Roman" w:hAnsi="Times New Roman" w:cs="Times New Roman"/>
+          <w:sz w:val="24"/>
+          <w:szCs w:val="24"/>
+        </w:rPr>
+        <w:commentReference w:id="63"/>
+      </w:r>
+      <w:r>
+        <w:rPr>
+          <w:rFonts w:ascii="Times New Roman" w:eastAsia="Times New Roman" w:hAnsi="Times New Roman" w:cs="Times New Roman"/>
+          <w:sz w:val="24"/>
+          <w:szCs w:val="24"/>
+        </w:rPr>
+        <w:t>and cover it with a piece of mesh to filter out rotifers and allow bacteria to pass through. Pipette x</w:t>
+      </w:r>
+      <w:ins w:id="64" w:author="Mendelson, Alex" w:date="2026-10-04T09:40:00Z" w16du:dateUtc="2026-10-04T16:40:00Z">
         <w:r>
           <w:rPr>
             <w:rFonts w:ascii="Times New Roman" w:eastAsia="Times New Roman" w:hAnsi="Times New Roman" w:cs="Times New Roman"/>
@@ -1354,7 +1342,7 @@
         </w:rPr>
         <w:t>μ</w:t>
       </w:r>
-      <w:ins w:id="61" w:author="Mendelson, Alex" w:date="2026-10-04T09:40:00Z" w16du:dateUtc="2026-10-04T16:40:00Z">
+      <w:ins w:id="65" w:author="Mendelson, Alex" w:date="2026-10-04T09:40:00Z" w16du:dateUtc="2026-10-04T16:40:00Z">
         <w:r>
           <w:rPr>
             <w:rFonts w:ascii="Times New Roman" w:eastAsia="Times New Roman" w:hAnsi="Times New Roman" w:cs="Times New Roman"/>
@@ -1364,7 +1352,7 @@
           <w:t>l</w:t>
         </w:r>
       </w:ins>
-      <w:del w:id="62" w:author="Mendelson, Alex" w:date="2026-10-04T09:40:00Z" w16du:dateUtc="2026-10-04T16:40:00Z">
+      <w:del w:id="66" w:author="Mendelson, Alex" w:date="2026-10-04T09:40:00Z" w16du:dateUtc="2026-10-04T16:40:00Z">
         <w:r>
           <w:rPr>
             <w:rFonts w:ascii="Times New Roman" w:eastAsia="Times New Roman" w:hAnsi="Times New Roman" w:cs="Times New Roman"/>
@@ -1391,7 +1379,7 @@
         <w:lastRenderedPageBreak/>
         <w:t>with which columns. For column 11, fill six wells with just rotifer medi</w:t>
       </w:r>
-      <w:ins w:id="63" w:author="Mendelson, Alex" w:date="2026-10-04T09:41:00Z" w16du:dateUtc="2026-10-04T16:41:00Z">
+      <w:ins w:id="67" w:author="Mendelson, Alex" w:date="2026-10-04T09:41:00Z" w16du:dateUtc="2026-10-04T16:41:00Z">
         <w:r>
           <w:rPr>
             <w:rFonts w:ascii="Times New Roman" w:eastAsia="Times New Roman" w:hAnsi="Times New Roman" w:cs="Times New Roman"/>
@@ -1401,7 +1389,7 @@
           <w:t>um</w:t>
         </w:r>
       </w:ins>
-      <w:del w:id="64" w:author="Mendelson, Alex" w:date="2026-10-04T09:41:00Z" w16du:dateUtc="2026-10-04T16:41:00Z">
+      <w:del w:id="68" w:author="Mendelson, Alex" w:date="2026-10-04T09:41:00Z" w16du:dateUtc="2026-10-04T16:41:00Z">
         <w:r>
           <w:rPr>
             <w:rFonts w:ascii="Times New Roman" w:eastAsia="Times New Roman" w:hAnsi="Times New Roman" w:cs="Times New Roman"/>
@@ -1459,9 +1447,56 @@
           <w:sz w:val="24"/>
           <w:szCs w:val="24"/>
         </w:rPr>
-        <w:t xml:space="preserve">Carry well plate to Spectramax 190 Microplate Reader and place onto loading rack. Using </w:t>
-      </w:r>
-      <w:commentRangeStart w:id="65"/>
+        <w:t xml:space="preserve">Carry well plate to Spectramax 190 Microplate Reader </w:t>
+      </w:r>
+      <w:ins w:id="69" w:author="Mendelson, Alex" w:date="2026-10-04T09:52:00Z" w16du:dateUtc="2026-10-04T16:52:00Z">
+        <w:r>
+          <w:rPr>
+            <w:rFonts w:ascii="Times New Roman" w:eastAsia="Times New Roman" w:hAnsi="Times New Roman" w:cs="Times New Roman"/>
+            <w:sz w:val="24"/>
+            <w:szCs w:val="24"/>
+          </w:rPr>
+          <w:t>(</w:t>
+        </w:r>
+        <w:commentRangeStart w:id="70"/>
+        <w:r>
+          <w:rPr>
+            <w:rFonts w:ascii="Times New Roman" w:eastAsia="Times New Roman" w:hAnsi="Times New Roman" w:cs="Times New Roman"/>
+            <w:sz w:val="24"/>
+            <w:szCs w:val="24"/>
+          </w:rPr>
+          <w:t>Molecular Devices, San Jose, CA, USA</w:t>
+        </w:r>
+      </w:ins>
+      <w:commentRangeEnd w:id="70"/>
+      <w:r>
+        <w:rPr>
+          <w:rStyle w:val="CommentReference"/>
+          <w:rFonts w:ascii="Times New Roman" w:eastAsia="Times New Roman" w:hAnsi="Times New Roman" w:cs="Times New Roman"/>
+          <w:sz w:val="24"/>
+          <w:szCs w:val="24"/>
+        </w:rPr>
+        <w:commentReference w:id="70"/>
+      </w:r>
+      <w:ins w:id="71" w:author="Mendelson, Alex" w:date="2026-10-04T09:52:00Z" w16du:dateUtc="2026-10-04T16:52:00Z">
+        <w:r>
+          <w:rPr>
+            <w:rFonts w:ascii="Times New Roman" w:eastAsia="Times New Roman" w:hAnsi="Times New Roman" w:cs="Times New Roman"/>
+            <w:sz w:val="24"/>
+            <w:szCs w:val="24"/>
+          </w:rPr>
+          <w:t xml:space="preserve">) </w:t>
+        </w:r>
+      </w:ins>
+      <w:r>
+        <w:rPr>
+          <w:rFonts w:ascii="Times New Roman" w:eastAsia="Times New Roman" w:hAnsi="Times New Roman" w:cs="Times New Roman"/>
+          <w:sz w:val="24"/>
+          <w:szCs w:val="24"/>
+        </w:rPr>
+        <w:t xml:space="preserve">and place onto loading rack. Using </w:t>
+      </w:r>
+      <w:commentRangeStart w:id="72"/>
       <w:r>
         <w:rPr>
           <w:rFonts w:ascii="Times New Roman" w:eastAsia="Times New Roman" w:hAnsi="Times New Roman" w:cs="Times New Roman"/>
@@ -1470,7 +1505,7 @@
         </w:rPr>
         <w:t>SoftMax Pro software</w:t>
       </w:r>
-      <w:commentRangeEnd w:id="65"/>
+      <w:commentRangeEnd w:id="72"/>
       <w:r>
         <w:rPr>
           <w:rStyle w:val="CommentReference"/>
@@ -1478,7 +1513,7 @@
           <w:sz w:val="24"/>
           <w:szCs w:val="24"/>
         </w:rPr>
-        <w:commentReference w:id="65"/>
+        <w:commentReference w:id="72"/>
       </w:r>
       <w:r>
         <w:rPr>
@@ -1488,7 +1523,7 @@
         </w:rPr>
         <w:t>, close rack, make sure the Lm1 wavelength is set to 600</w:t>
       </w:r>
-      <w:ins w:id="66" w:author="Mendelson, Alex" w:date="2026-10-04T09:42:00Z" w16du:dateUtc="2026-10-04T16:42:00Z">
+      <w:ins w:id="73" w:author="Mendelson, Alex" w:date="2026-10-04T09:42:00Z" w16du:dateUtc="2026-10-04T16:42:00Z">
         <w:r>
           <w:rPr>
             <w:rFonts w:ascii="Times New Roman" w:eastAsia="Times New Roman" w:hAnsi="Times New Roman" w:cs="Times New Roman"/>
@@ -1610,7 +1645,87 @@
 
 <file path=word/comments.xml><?xml version="1.0" encoding="utf-8"?>
 <w:comments xmlns:wpc="http://schemas.microsoft.com/office/word/2010/wordprocessingCanvas" xmlns:cx="http://schemas.microsoft.com/office/drawing/2014/chartex" xmlns:cx1="http://schemas.microsoft.com/office/drawing/2015/9/8/chartex" xmlns:cx2="http://schemas.microsoft.com/office/drawing/2015/10/21/chartex" xmlns:cx3="http://schemas.microsoft.com/office/drawing/2016/5/9/chartex" xmlns:cx4="http://schemas.microsoft.com/office/drawing/2016/5/10/chartex" xmlns:cx5="http://schemas.microsoft.com/office/drawing/2016/5/11/chartex" xmlns:cx6="http://schemas.microsoft.com/office/drawing/2016/5/12/chartex" xmlns:cx7="http://schemas.microsoft.com/office/drawing/2016/5/13/chartex" xmlns:cx8="http://schemas.microsoft.com/office/drawing/2016/5/14/chartex" xmlns:mc="http://schemas.openxmlformats.org/markup-compatibility/2006" xmlns:aink="http://schemas.microsoft.com/office/drawing/2016/ink" xmlns:am3d="http://schemas.microsoft.com/office/drawing/2017/model3d" xmlns:o="urn:schemas-microsoft-com:office:office" xmlns:oel="http://schemas.microsoft.com/office/2019/extlst" xmlns:r="http://schemas.openxmlformats.org/officeDocument/2006/relationships" xmlns:m="http://schemas.openxmlformats.org/officeDocument/2006/math" xmlns:v="urn:schemas-microsoft-com:vml" xmlns:wp14="http://schemas.microsoft.com/office/word/2010/wordprocessingDrawing" xmlns:wp="http://schemas.openxmlformats.org/drawingml/2006/wordprocessingDrawing" xmlns:w10="urn:schemas-microsoft-com:office:word" xmlns:w="http://schemas.openxmlformats.org/wordprocessingml/2006/main" xmlns:w14="http://schemas.microsoft.com/office/word/2010/wordml" xmlns:w15="http://schemas.microsoft.com/office/word/2012/wordml" xmlns:w16cex="http://schemas.microsoft.com/office/word/2018/wordml/cex" xmlns:w16cid="http://schemas.microsoft.com/office/word/2016/wordml/cid" xmlns:w16="http://schemas.microsoft.com/office/word/2018/wordml" xmlns:w16du="http://schemas.microsoft.com/office/word/2023/wordml/word16du" xmlns:w16sdtdh="http://schemas.microsoft.com/office/word/2020/wordml/sdtdatahash" xmlns:w16sdtfl="http://schemas.microsoft.com/office/word/2024/wordml/sdtformatlock" xmlns:w16se="http://schemas.microsoft.com/office/word/2015/wordml/symex" xmlns:wpg="http://schemas.microsoft.com/office/word/2010/wordprocessingGroup" xmlns:wpi="http://schemas.microsoft.com/office/word/2010/wordprocessingInk" xmlns:wne="http://schemas.microsoft.com/office/word/2006/wordml" xmlns:wps="http://schemas.microsoft.com/office/word/2010/wordprocessingShape" mc:Ignorable="w14 w15 w16se w16cid w16 w16cex w16sdtdh w16sdtfl w16du wp14">
-  <w:comment w:id="65" w:author="Mendelson, Alex" w:date="2026-10-04T09:42:00Z" w:initials="AM">
+  <w:comment w:id="22" w:author="Mendelson, Alex" w:date="2026-10-04T09:46:00Z" w:initials="AM">
+    <w:p>
+      <w:pPr>
+        <w:pStyle w:val="CommentText"/>
+      </w:pPr>
+      <w:r>
+        <w:rPr>
+          <w:rStyle w:val="CommentReference"/>
+        </w:rPr>
+        <w:annotationRef/>
+      </w:r>
+      <w:r>
+        <w:t>Include magnification (and if using phase contrast or just regular brightfield)</w:t>
+      </w:r>
+    </w:p>
+  </w:comment>
+  <w:comment w:id="35" w:author="Mendelson, Alex" w:date="2026-10-04T09:49:00Z" w:initials="AM">
+    <w:p>
+      <w:pPr>
+        <w:pStyle w:val="CommentText"/>
+      </w:pPr>
+      <w:r>
+        <w:rPr>
+          <w:rStyle w:val="CommentReference"/>
+        </w:rPr>
+        <w:annotationRef/>
+      </w:r>
+      <w:r>
+        <w:t>Do you have these probes yet? If you do (or, when you do), grab their manufacturing details like you did for the spectrophotometer below.</w:t>
+      </w:r>
+    </w:p>
+  </w:comment>
+  <w:comment w:id="62" w:author="Mendelson, Alex" w:date="2026-10-04T09:46:00Z" w:initials="AM">
+    <w:p>
+      <w:pPr>
+        <w:pStyle w:val="CommentText"/>
+      </w:pPr>
+      <w:r>
+        <w:rPr>
+          <w:rStyle w:val="CommentReference"/>
+        </w:rPr>
+        <w:annotationRef/>
+      </w:r>
+      <w:r>
+        <w:t>magnification</w:t>
+      </w:r>
+    </w:p>
+  </w:comment>
+  <w:comment w:id="63" w:author="Mendelson, Alex" w:date="2026-10-04T09:47:00Z" w:initials="AM">
+    <w:p>
+      <w:pPr>
+        <w:pStyle w:val="CommentText"/>
+      </w:pPr>
+      <w:r>
+        <w:rPr>
+          <w:rStyle w:val="CommentReference"/>
+        </w:rPr>
+        <w:annotationRef/>
+      </w:r>
+      <w:r>
+        <w:t>Maybe include whether these are round- or flat-bottom? And also, clarify if there is any coating, which should be mentioned on the package or on the manufacturer’s store page online/</w:t>
+      </w:r>
+    </w:p>
+  </w:comment>
+  <w:comment w:id="70" w:author="Mendelson, Alex" w:date="2026-10-04T09:53:00Z" w:initials="AM">
+    <w:p>
+      <w:pPr>
+        <w:pStyle w:val="CommentText"/>
+      </w:pPr>
+      <w:r>
+        <w:rPr>
+          <w:rStyle w:val="CommentReference"/>
+        </w:rPr>
+        <w:annotationRef/>
+      </w:r>
+      <w:r>
+        <w:t>Not necessary for here, but just FYI for when you write a real methods section, you’ll want to have the manufacturer info for lab equipment</w:t>
+      </w:r>
+    </w:p>
+  </w:comment>
+  <w:comment w:id="72" w:author="Mendelson, Alex" w:date="2026-10-04T09:42:00Z" w:initials="AM">
     <w:p>
       <w:pPr>
         <w:pStyle w:val="CommentText"/>
@@ -1631,18 +1746,33 @@
 
 <file path=word/commentsExtended.xml><?xml version="1.0" encoding="utf-8"?>
 <w15:commentsEx xmlns:wpc="http://schemas.microsoft.com/office/word/2010/wordprocessingCanvas" xmlns:cx="http://schemas.microsoft.com/office/drawing/2014/chartex" xmlns:cx1="http://schemas.microsoft.com/office/drawing/2015/9/8/chartex" xmlns:cx2="http://schemas.microsoft.com/office/drawing/2015/10/21/chartex" xmlns:cx3="http://schemas.microsoft.com/office/drawing/2016/5/9/chartex" xmlns:cx4="http://schemas.microsoft.com/office/drawing/2016/5/10/chartex" xmlns:cx5="http://schemas.microsoft.com/office/drawing/2016/5/11/chartex" xmlns:cx6="http://schemas.microsoft.com/office/drawing/2016/5/12/chartex" xmlns:cx7="http://schemas.microsoft.com/office/drawing/2016/5/13/chartex" xmlns:cx8="http://schemas.microsoft.com/office/drawing/2016/5/14/chartex" xmlns:mc="http://schemas.openxmlformats.org/markup-compatibility/2006" xmlns:aink="http://schemas.microsoft.com/office/drawing/2016/ink" xmlns:am3d="http://schemas.microsoft.com/office/drawing/2017/model3d" xmlns:o="urn:schemas-microsoft-com:office:office" xmlns:oel="http://schemas.microsoft.com/office/2019/extlst" xmlns:r="http://schemas.openxmlformats.org/officeDocument/2006/relationships" xmlns:m="http://schemas.openxmlformats.org/officeDocument/2006/math" xmlns:v="urn:schemas-microsoft-com:vml" xmlns:wp14="http://schemas.microsoft.com/office/word/2010/wordprocessingDrawing" xmlns:wp="http://schemas.openxmlformats.org/drawingml/2006/wordprocessingDrawing" xmlns:w10="urn:schemas-microsoft-com:office:word" xmlns:w="http://schemas.openxmlformats.org/wordprocessingml/2006/main" xmlns:w14="http://schemas.microsoft.com/office/word/2010/wordml" xmlns:w15="http://schemas.microsoft.com/office/word/2012/wordml" xmlns:w16cex="http://schemas.microsoft.com/office/word/2018/wordml/cex" xmlns:w16cid="http://schemas.microsoft.com/office/word/2016/wordml/cid" xmlns:w16="http://schemas.microsoft.com/office/word/2018/wordml" xmlns:w16du="http://schemas.microsoft.com/office/word/2023/wordml/word16du" xmlns:w16sdtdh="http://schemas.microsoft.com/office/word/2020/wordml/sdtdatahash" xmlns:w16sdtfl="http://schemas.microsoft.com/office/word/2024/wordml/sdtformatlock" xmlns:w16se="http://schemas.microsoft.com/office/word/2015/wordml/symex" xmlns:wpg="http://schemas.microsoft.com/office/word/2010/wordprocessingGroup" xmlns:wpi="http://schemas.microsoft.com/office/word/2010/wordprocessingInk" xmlns:wne="http://schemas.microsoft.com/office/word/2006/wordml" xmlns:wps="http://schemas.microsoft.com/office/word/2010/wordprocessingShape" mc:Ignorable="w14 w15 w16se w16cid w16 w16cex w16sdtdh w16sdtfl w16du wp14">
+  <w15:commentEx w15:paraId="252EFC8C" w15:done="0"/>
+  <w15:commentEx w15:paraId="7E6147BC" w15:done="0"/>
+  <w15:commentEx w15:paraId="3B2130E8" w15:done="0"/>
+  <w15:commentEx w15:paraId="4188E00C" w15:done="0"/>
+  <w15:commentEx w15:paraId="11824ABD" w15:done="0"/>
   <w15:commentEx w15:paraId="44D9C5A7" w15:done="0"/>
 </w15:commentsEx>
 </file>
 
 <file path=word/commentsExtensible.xml><?xml version="1.0" encoding="utf-8"?>
 <w16cex:commentsExtensible xmlns:wpc="http://schemas.microsoft.com/office/word/2010/wordprocessingCanvas" xmlns:cx="http://schemas.microsoft.com/office/drawing/2014/chartex" xmlns:cx1="http://schemas.microsoft.com/office/drawing/2015/9/8/chartex" xmlns:cx2="http://schemas.microsoft.com/office/drawing/2015/10/21/chartex" xmlns:cx3="http://schemas.microsoft.com/office/drawing/2016/5/9/chartex" xmlns:cx4="http://schemas.microsoft.com/office/drawing/2016/5/10/chartex" xmlns:cx5="http://schemas.microsoft.com/office/drawing/2016/5/11/chartex" xmlns:cx6="http://schemas.microsoft.com/office/drawing/2016/5/12/chartex" xmlns:cx7="http://schemas.microsoft.com/office/drawing/2016/5/13/chartex" xmlns:cx8="http://schemas.microsoft.com/office/drawing/2016/5/14/chartex" xmlns:cr="http://schemas.microsoft.com/office/comments/2020/reactions" xmlns:mc="http://schemas.openxmlformats.org/markup-compatibility/2006" xmlns:aink="http://schemas.microsoft.com/office/drawing/2016/ink" xmlns:am3d="http://schemas.microsoft.com/office/drawing/2017/model3d" xmlns:o="urn:schemas-microsoft-com:office:office" xmlns:oel="http://schemas.microsoft.com/office/2019/extlst" xmlns:r="http://schemas.openxmlformats.org/officeDocument/2006/relationships" xmlns:m="http://schemas.openxmlformats.org/officeDocument/2006/math" xmlns:v="urn:schemas-microsoft-com:vml" xmlns:wp14="http://schemas.microsoft.com/office/word/2010/wordprocessingDrawing" xmlns:wp="http://schemas.openxmlformats.org/drawingml/2006/wordprocessingDrawing" xmlns:w10="urn:schemas-microsoft-com:office:word" xmlns:w="http://schemas.openxmlformats.org/wordprocessingml/2006/main" xmlns:w14="http://schemas.microsoft.com/office/word/2010/wordml" xmlns:w15="http://schemas.microsoft.com/office/word/2012/wordml" xmlns:w16cex="http://schemas.microsoft.com/office/word/2018/wordml/cex" xmlns:w16cid="http://schemas.microsoft.com/office/word/2016/wordml/cid" xmlns:w16="http://schemas.microsoft.com/office/word/2018/wordml" xmlns:w16du="http://schemas.microsoft.com/office/word/2023/wordml/word16du" xmlns:w16sdtdh="http://schemas.microsoft.com/office/word/2020/wordml/sdtdatahash" xmlns:w16sdtfl="http://schemas.microsoft.com/office/word/2024/wordml/sdtformatlock" xmlns:w16se="http://schemas.microsoft.com/office/word/2015/wordml/symex" xmlns:wpg="http://schemas.microsoft.com/office/word/2010/wordprocessingGroup" xmlns:wpi="http://schemas.microsoft.com/office/word/2010/wordprocessingInk" xmlns:wne="http://schemas.microsoft.com/office/word/2006/wordml" xmlns:wps="http://schemas.microsoft.com/office/word/2010/wordprocessingShape" mc:Ignorable="w14 w15 w16se w16cid w16 w16cex w16sdtdh w16sdtfl cr w16du wp14">
+  <w16cex:commentExtensible w16cex:durableId="0EC0F929" w16cex:dateUtc="2026-10-04T16:46:00Z"/>
+  <w16cex:commentExtensible w16cex:durableId="1A116BD5" w16cex:dateUtc="2026-10-04T16:49:00Z"/>
+  <w16cex:commentExtensible w16cex:durableId="624D7B3F" w16cex:dateUtc="2026-10-04T16:46:00Z"/>
+  <w16cex:commentExtensible w16cex:durableId="6302D634" w16cex:dateUtc="2026-10-04T16:47:00Z"/>
+  <w16cex:commentExtensible w16cex:durableId="2F005823" w16cex:dateUtc="2026-10-04T16:53:00Z"/>
   <w16cex:commentExtensible w16cex:durableId="76A004C4" w16cex:dateUtc="2026-10-04T16:42:00Z"/>
 </w16cex:commentsExtensible>
 </file>
 
 <file path=word/commentsIds.xml><?xml version="1.0" encoding="utf-8"?>
 <w16cid:commentsIds xmlns:wpc="http://schemas.microsoft.com/office/word/2010/wordprocessingCanvas" xmlns:cx="http://schemas.microsoft.com/office/drawing/2014/chartex" xmlns:cx1="http://schemas.microsoft.com/office/drawing/2015/9/8/chartex" xmlns:cx2="http://schemas.microsoft.com/office/drawing/2015/10/21/chartex" xmlns:cx3="http://schemas.microsoft.com/office/drawing/2016/5/9/chartex" xmlns:cx4="http://schemas.microsoft.com/office/drawing/2016/5/10/chartex" xmlns:cx5="http://schemas.microsoft.com/office/drawing/2016/5/11/chartex" xmlns:cx6="http://schemas.microsoft.com/office/drawing/2016/5/12/chartex" xmlns:cx7="http://schemas.microsoft.com/office/drawing/2016/5/13/chartex" xmlns:cx8="http://schemas.microsoft.com/office/drawing/2016/5/14/chartex" xmlns:mc="http://schemas.openxmlformats.org/markup-compatibility/2006" xmlns:aink="http://schemas.microsoft.com/office/drawing/2016/ink" xmlns:am3d="http://schemas.microsoft.com/office/drawing/2017/model3d" xmlns:o="urn:schemas-microsoft-com:office:office" xmlns:oel="http://schemas.microsoft.com/office/2019/extlst" xmlns:r="http://schemas.openxmlformats.org/officeDocument/2006/relationships" xmlns:m="http://schemas.openxmlformats.org/officeDocument/2006/math" xmlns:v="urn:schemas-microsoft-com:vml" xmlns:wp14="http://schemas.microsoft.com/office/word/2010/wordprocessingDrawing" xmlns:wp="http://schemas.openxmlformats.org/drawingml/2006/wordprocessingDrawing" xmlns:w10="urn:schemas-microsoft-com:office:word" xmlns:w="http://schemas.openxmlformats.org/wordprocessingml/2006/main" xmlns:w14="http://schemas.microsoft.com/office/word/2010/wordml" xmlns:w15="http://schemas.microsoft.com/office/word/2012/wordml" xmlns:w16cex="http://schemas.microsoft.com/office/word/2018/wordml/cex" xmlns:w16cid="http://schemas.microsoft.com/office/word/2016/wordml/cid" xmlns:w16="http://schemas.microsoft.com/office/word/2018/wordml" xmlns:w16du="http://schemas.microsoft.com/office/word/2023/wordml/word16du" xmlns:w16sdtdh="http://schemas.microsoft.com/office/word/2020/wordml/sdtdatahash" xmlns:w16sdtfl="http://schemas.microsoft.com/office/word/2024/wordml/sdtformatlock" xmlns:w16se="http://schemas.microsoft.com/office/word/2015/wordml/symex" xmlns:wpg="http://schemas.microsoft.com/office/word/2010/wordprocessingGroup" xmlns:wpi="http://schemas.microsoft.com/office/word/2010/wordprocessingInk" xmlns:wne="http://schemas.microsoft.com/office/word/2006/wordml" xmlns:wps="http://schemas.microsoft.com/office/word/2010/wordprocessingShape" mc:Ignorable="w14 w15 w16se w16cid w16 w16cex w16sdtdh w16sdtfl w16du wp14">
+  <w16cid:commentId w16cid:paraId="252EFC8C" w16cid:durableId="0EC0F929"/>
+  <w16cid:commentId w16cid:paraId="7E6147BC" w16cid:durableId="1A116BD5"/>
+  <w16cid:commentId w16cid:paraId="3B2130E8" w16cid:durableId="624D7B3F"/>
+  <w16cid:commentId w16cid:paraId="4188E00C" w16cid:durableId="6302D634"/>
+  <w16cid:commentId w16cid:paraId="11824ABD" w16cid:durableId="2F005823"/>
   <w16cid:commentId w16cid:paraId="44D9C5A7" w16cid:durableId="76A004C4"/>
 </w16cid:commentsIds>
 </file>

</xml_diff>